<commit_message>
se corrigio espacios de descripscion a descripcion de acta de visualizacion
</commit_message>
<xml_diff>
--- a/plantillas/acta_visualizacion_video.docx
+++ b/plantillas/acta_visualizacion_video.docx
@@ -358,63 +358,71 @@
     <w:p>
       <w:pPr>
         <w:jc w:val="both"/>
+      </w:pPr>
+      <w:r>
         <w:rPr>
           <w:rFonts w:ascii="Arial" w:hAnsi="Arial"/>
         </w:rPr>
+        <w:t>${DESCRIPCIONES_VIDEO}</w:t>
+      </w:r>
+    </w:p>
+    <w:p>
+      <w:pPr>
+        <w:jc w:val="both"/>
       </w:pPr>
       <w:r>
         <w:rPr>
           <w:rFonts w:ascii="Arial" w:hAnsi="Arial"/>
-        </w:rPr>
-        <w:t>${DESCRIPCIONES_VIDEO}</w:t>
-      </w:r>
-    </w:p>
-    <w:p>
-      <w:pPr>
-        <w:jc w:val="both"/>
-      </w:pPr>
-    </w:p>
-    <w:p>
-      <w:pPr>
-        <w:jc w:val="both"/>
+          <w:b/>
+        </w:rPr>
+        <w:t>${disco_encabezado}</w:t>
+      </w:r>
+    </w:p>
+    <w:p>
+      <w:pPr>
+        <w:jc w:val="both"/>
+      </w:pPr>
+      <w:r>
         <w:rPr>
           <w:rFonts w:ascii="Arial" w:hAnsi="Arial"/>
           <w:b/>
         </w:rPr>
+        <w:t>${archivo_encabezado}</w:t>
+      </w:r>
+    </w:p>
+    <w:p>
+      <w:pPr>
+        <w:jc w:val="both"/>
       </w:pPr>
       <w:r>
         <w:rPr>
           <w:rFonts w:ascii="Arial" w:hAnsi="Arial"/>
           <w:b/>
         </w:rPr>
-        <w:t>${disco_encabezado}</w:t>
-      </w:r>
-    </w:p>
-    <w:p>
-      <w:pPr>
-        <w:jc w:val="both"/>
-      </w:pPr>
-    </w:p>
-    <w:p>
-      <w:pPr>
-        <w:jc w:val="both"/>
+        <w:t>${descripcion_tiempo}</w:t>
+      </w:r>
+    </w:p>
+    <w:p>
+      <w:pPr>
+        <w:jc w:val="both"/>
+      </w:pPr>
+      <w:r>
         <w:rPr>
           <w:rFonts w:ascii="Arial" w:hAnsi="Arial"/>
-          <w:b/>
-        </w:rPr>
+        </w:rPr>
+        <w:t>${descripcion_detalle}</w:t>
+      </w:r>
+    </w:p>
+    <w:p>
+      <w:pPr>
+        <w:jc w:val="both"/>
       </w:pPr>
       <w:r>
         <w:rPr>
           <w:rFonts w:ascii="Arial" w:hAnsi="Arial"/>
-          <w:b/>
-        </w:rPr>
-        <w:t>${archivo_encabezado}</w:t>
-      </w:r>
-    </w:p>
-    <w:p>
-      <w:pPr>
-        <w:jc w:val="both"/>
-      </w:pPr>
+        </w:rPr>
+        <w:t>${descripcion_captura}</w:t>
+      </w:r>
     </w:p>
     <w:p>
       <w:pPr>
@@ -423,31 +431,8 @@
       <w:r>
         <w:rPr>
           <w:rFonts w:ascii="Arial" w:hAnsi="Arial"/>
-          <w:b/>
-        </w:rPr>
-        <w:t>${descripcion_tiempo}</w:t>
-      </w:r>
-    </w:p>
-    <w:p>
-      <w:pPr>
-        <w:jc w:val="both"/>
-      </w:pPr>
-      <w:r>
-        <w:rPr>
-          <w:rFonts w:ascii="Arial" w:hAnsi="Arial"/>
-        </w:rPr>
-        <w:t>${descripcion_detalle}</w:t>
-      </w:r>
-    </w:p>
-    <w:p>
-      <w:pPr>
-        <w:jc w:val="both"/>
-      </w:pPr>
-      <w:r>
-        <w:rPr>
-          <w:rFonts w:ascii="Arial" w:hAnsi="Arial"/>
-        </w:rPr>
-        <w:t>${descripcion_captura}</w:t>
+        </w:rPr>
+        <w:t/>
       </w:r>
     </w:p>
     <w:p>

</xml_diff>